<commit_message>
Expand bibliography to 19 verified references, weave citations into mechanism, data and strategy, correct Battistini et al. to EER 2025
</commit_message>
<xml_diff>
--- a/PA3_polishing.docx
+++ b/PA3_polishing.docx
@@ -267,7 +267,7 @@
           <w:i w:val="false"/>
           <w:iCs w:val="false"/>
         </w:rPr>
-        <w:t xml:space="preserve">First, the paper provides direct evidence on house prices, rather than consumption or mortgage payments, for the mortgage structure channel of monetary policy in the euro area, on a sample long enough to include the 2022 to 2023 tightening cycle and the 2024 to 2025 easing. Second, it shows that separating monetary policy shocks from central bank information shocks is essential for housing outcomes: without the correction the estimated response has the wrong sign. Third, it offers a transparent assessment of what a cross country design can identify: one common shock and eleven countries cannot pin down the differential response by mortgage structure, which qualifies the existing cross country evidence and supports moving to regional data, as in Battistini et al. (2024).</w:t>
+        <w:t xml:space="preserve">First, the paper provides direct evidence on house prices, rather than consumption or mortgage payments, for the mortgage structure channel of monetary policy in the euro area, on a sample long enough to include the 2022 to 2023 tightening cycle and the 2024 to 2025 easing. Second, it shows that separating monetary policy shocks from central bank information shocks is essential for housing outcomes: without the correction the estimated response has the wrong sign. Third, it offers a transparent assessment of what a cross country design can identify: one common shock and eleven countries cannot pin down the differential response by mortgage structure, which qualifies the existing cross country evidence and supports moving to regional data, as in Battistini et al. (2025).</w:t>
       </w:r>
     </w:p>
     <w:p>
@@ -304,7 +304,7 @@
           <w:i w:val="false"/>
           <w:iCs w:val="false"/>
         </w:rPr>
-        <w:t xml:space="preserve">Three directions follow directly from the limitations. First, the binary mortgage market indicator discards a lot of information, because the variable rate share differs strongly within the two groups. A continuous share as moderator would use this variation; with only eleven countries this extra variation could be decisive for statistical power. I kept the binary design because it was fixed with my supervisor before estimation, but a follow up should relax it. Second, regional house price data would address the power problem at its root. Within country variation multiplies the number of observations and allows time fixed effects that absorb the common shock, which my country level design cannot include because time effects would absorb the shock itself. Battistini et al. (2024) show that this route is feasible for the euro area. Third, the budget channel could be tested directly instead of being inferred from country groups, by linking household level data on mortgage payment resets to local house price changes; this would show whether the mechanism operates even though it does not show up at the country level.</w:t>
+        <w:t xml:space="preserve">Three directions follow directly from the limitations. First, the binary mortgage market indicator discards a lot of information, because the variable rate share differs strongly within the two groups. A continuous share as moderator would use this variation; with only eleven countries this extra variation could be decisive for statistical power. I kept the binary design because it was fixed with my supervisor before estimation, but a follow up should relax it. Second, regional house price data would address the power problem at its root. Within country variation multiplies the number of observations and allows time fixed effects that absorb the common shock, which my country level design cannot include because time effects would absorb the shock itself. Battistini et al. (2025) show that this route is feasible for the euro area. Third, the budget channel could be tested directly instead of being inferred from country groups, by linking household level data on mortgage payment resets to local house price changes; this would show whether the mechanism operates even though it does not show up at the country level.</w:t>
       </w:r>
     </w:p>
     <w:p>
@@ -355,7 +355,7 @@
           <w:i w:val="false"/>
           <w:iCs w:val="false"/>
         </w:rPr>
-        <w:t xml:space="preserve">Battistini, N., Falagiarda, M., Hackmann, A., Roma, M. (2024). Navigating the housing channel of monetary policy across euro area regions. European Central Bank Working Paper.</w:t>
+        <w:t xml:space="preserve">Battistini, N., Falagiarda, M., Hackmann, A., Roma, M. (2025). Navigating the housing channel of monetary policy across euro area regions. European Economic Review 171.</w:t>
       </w:r>
     </w:p>
     <w:p>

</xml_diff>